<commit_message>
Add observability architecture to developer design
</commit_message>
<xml_diff>
--- a/docs/14Sep2026/2026-09-15_GRP_MVP1_Hub_SIG_Architecture_Design_v1.0.docx
+++ b/docs/14Sep2026/2026-09-15_GRP_MVP1_Hub_SIG_Architecture_Design_v1.0.docx
@@ -4077,7 +4077,277 @@
         <w:pStyle w:val="Heading2"/>
       </w:pPr>
       <w:r>
-        <w:t>15.1 Health and metrics</w:t>
+        <w:t>15.1 Observability architecture</w:t>
+      </w:r>
+    </w:p>
+    <w:p>
+      <w:pPr>
+        <w:jc w:val="center"/>
+      </w:pPr>
+      <w:r>
+        <w:drawing>
+          <wp:inline xmlns:a="http://schemas.openxmlformats.org/drawingml/2006/main" xmlns:pic="http://schemas.openxmlformats.org/drawingml/2006/picture">
+            <wp:extent cx="5852160" cy="1838756"/>
+            <wp:docPr id="4" name="Picture 4"/>
+            <wp:cNvGraphicFramePr>
+              <a:graphicFrameLocks noChangeAspect="1"/>
+            </wp:cNvGraphicFramePr>
+            <a:graphic>
+              <a:graphicData uri="http://schemas.openxmlformats.org/drawingml/2006/picture">
+                <pic:pic>
+                  <pic:nvPicPr>
+                    <pic:cNvPr id="0" name="grp_observability.png"/>
+                    <pic:cNvPicPr/>
+                  </pic:nvPicPr>
+                  <pic:blipFill>
+                    <a:blip r:embed="rId14"/>
+                    <a:stretch>
+                      <a:fillRect/>
+                    </a:stretch>
+                  </pic:blipFill>
+                  <pic:spPr>
+                    <a:xfrm>
+                      <a:off x="0" y="0"/>
+                      <a:ext cx="5852160" cy="1838756"/>
+                    </a:xfrm>
+                    <a:prstGeom prst="rect"/>
+                  </pic:spPr>
+                </pic:pic>
+              </a:graphicData>
+            </a:graphic>
+          </wp:inline>
+        </w:drawing>
+      </w:r>
+    </w:p>
+    <w:p>
+      <w:pPr>
+        <w:pStyle w:val="Caption"/>
+        <w:jc w:val="center"/>
+      </w:pPr>
+      <w:r>
+        <w:t>Figure 4. OpenTelemetry, Langfuse, durable workflow state and the Admin monitoring experience.</w:t>
+      </w:r>
+    </w:p>
+    <w:p>
+      <w:r>
+        <w:t>Use OpenTelemetry and Langfuse together rather than treating them as alternatives:</w:t>
+      </w:r>
+    </w:p>
+    <w:p>
+      <w:pPr>
+        <w:pStyle w:val="ListBullet"/>
+      </w:pPr>
+      <w:r>
+        <w:t>OpenTelemetry covers HTTP, database, worker, GIS, queue and SIG dependency telemetry.</w:t>
+      </w:r>
+    </w:p>
+    <w:p>
+      <w:pPr>
+        <w:pStyle w:val="ListBullet"/>
+      </w:pPr>
+      <w:r>
+        <w:t>Langfuse covers model generations, prompts, tokens, cost, evaluations, feedback and governed-answer observations.</w:t>
+      </w:r>
+    </w:p>
+    <w:p>
+      <w:pPr>
+        <w:pStyle w:val="ListBullet"/>
+      </w:pPr>
+      <w:r>
+        <w:t xml:space="preserve">PostGIS remains the durable workflow truth and stores </w:t>
+      </w:r>
+      <w:r>
+        <w:rPr>
+          <w:rFonts w:ascii="Consolas" w:hAnsi="Consolas"/>
+          <w:color w:val="1B6CA8"/>
+          <w:sz w:val="17"/>
+        </w:rPr>
+        <w:t>audit_event</w:t>
+      </w:r>
+      <w:r>
+        <w:t xml:space="preserve"> plus </w:t>
+      </w:r>
+      <w:r>
+        <w:rPr>
+          <w:rFonts w:ascii="Consolas" w:hAnsi="Consolas"/>
+          <w:color w:val="1B6CA8"/>
+          <w:sz w:val="17"/>
+        </w:rPr>
+        <w:t>llm_usage</w:t>
+      </w:r>
+      <w:r>
+        <w:t>; neither telemetry system replaces application state or security audit.</w:t>
+      </w:r>
+    </w:p>
+    <w:p>
+      <w:r>
+        <w:t xml:space="preserve">Instrument </w:t>
+      </w:r>
+      <w:r>
+        <w:rPr>
+          <w:rFonts w:ascii="Consolas" w:hAnsi="Consolas"/>
+          <w:color w:val="1B6CA8"/>
+          <w:sz w:val="17"/>
+        </w:rPr>
+        <w:t>grp-api</w:t>
+      </w:r>
+      <w:r>
+        <w:t xml:space="preserve"> and </w:t>
+      </w:r>
+      <w:r>
+        <w:rPr>
+          <w:rFonts w:ascii="Consolas" w:hAnsi="Consolas"/>
+          <w:color w:val="1B6CA8"/>
+          <w:sz w:val="17"/>
+        </w:rPr>
+        <w:t>grp-worker</w:t>
+      </w:r>
+      <w:r>
+        <w:t xml:space="preserve"> with OpenTelemetry SDKs. Run one lightweight OpenTelemetry Collector per VM to redact, batch, retry and export telemetry. The Collector is not a datastore or dashboard; export to ADPC’s approved monitoring service, a managed Grafana service, or a separately operated Prometheus/Tempo/Loki/Grafana stack. Do not initially self-host the complete observability stack on the CPU-bound application VMs.</w:t>
+      </w:r>
+    </w:p>
+    <w:p>
+      <w:r>
+        <w:t>Continue using the existing hosted Langfuse project for the controlled AI pilot unless data-residency policy requires a dedicated observability environment. Do not use Langfuse as the uptime monitor, job queue, authorization audit or canonical cost ledger.</w:t>
+      </w:r>
+    </w:p>
+    <w:p>
+      <w:r>
+        <w:t>Carry these correlation fields across authorized boundaries:</w:t>
+      </w:r>
+    </w:p>
+    <w:p>
+      <w:pPr>
+        <w:spacing w:before="60" w:after="120"/>
+        <w:ind w:left="283" w:right="170"/>
+        <w:shd w:fill="EFF3F5"/>
+      </w:pPr>
+      <w:r>
+        <w:rPr>
+          <w:rFonts w:ascii="Consolas" w:hAnsi="Consolas"/>
+          <w:color w:val="173B57"/>
+          <w:sz w:val="15"/>
+        </w:rPr>
+        <w:t>trace_id</w:t>
+        <w:br/>
+        <w:t>workflow_id</w:t>
+        <w:br/>
+        <w:t>assessment_id</w:t>
+        <w:br/>
+        <w:t>job_attempt_id</w:t>
+        <w:br/>
+        <w:t>hub_id</w:t>
+        <w:br/>
+        <w:t>pack_id</w:t>
+        <w:br/>
+        <w:t>report_id</w:t>
+        <w:br/>
+        <w:t>receipt_id</w:t>
+      </w:r>
+    </w:p>
+    <w:p>
+      <w:r>
+        <w:t xml:space="preserve">The API stores trace context with the database job. A worker starts a linked consumer span when it claims the job rather than pretending that a potentially long queue wait is one synchronous request. Hub-to-SIG calls carry W3C </w:t>
+      </w:r>
+      <w:r>
+        <w:rPr>
+          <w:rFonts w:ascii="Consolas" w:hAnsi="Consolas"/>
+          <w:color w:val="1B6CA8"/>
+          <w:sz w:val="17"/>
+        </w:rPr>
+        <w:t>traceparent</w:t>
+      </w:r>
+      <w:r>
+        <w:t xml:space="preserve"> and </w:t>
+      </w:r>
+      <w:r>
+        <w:rPr>
+          <w:rFonts w:ascii="Consolas" w:hAnsi="Consolas"/>
+          <w:color w:val="1B6CA8"/>
+          <w:sz w:val="17"/>
+        </w:rPr>
+        <w:t>X-Correlation-ID</w:t>
+      </w:r>
+      <w:r>
+        <w:t xml:space="preserve"> when SIG accepts them. Trace context is telemetry only and never grants access.</w:t>
+      </w:r>
+    </w:p>
+    <w:p>
+      <w:r>
+        <w:t>The Admin experience has four separately authorized views:</w:t>
+      </w:r>
+    </w:p>
+    <w:p>
+      <w:pPr>
+        <w:pStyle w:val="ListNumber"/>
+      </w:pPr>
+      <w:r>
+        <w:rPr>
+          <w:b/>
+          <w:color w:val="173B57"/>
+        </w:rPr>
+        <w:t>System health:</w:t>
+      </w:r>
+      <w:r>
+        <w:t xml:space="preserve"> API availability/latency, worker heartbeat, queue depth/age, failures, CPU/memory/disk, database readiness, backup age and SIG dependency status.</w:t>
+      </w:r>
+    </w:p>
+    <w:p>
+      <w:pPr>
+        <w:pStyle w:val="ListNumber"/>
+      </w:pPr>
+      <w:r>
+        <w:rPr>
+          <w:b/>
+          <w:color w:val="173B57"/>
+        </w:rPr>
+        <w:t>Workflow explorer:</w:t>
+      </w:r>
+      <w:r>
+        <w:t xml:space="preserve"> submitted, validated, queued, worker started, GIS completed, SIG pack assembled, draft generated, gate result and receipt minted—with duration, safe error and exact identifiers at each stage.</w:t>
+      </w:r>
+    </w:p>
+    <w:p>
+      <w:pPr>
+        <w:pStyle w:val="ListNumber"/>
+      </w:pPr>
+      <w:r>
+        <w:rPr>
+          <w:b/>
+          <w:color w:val="173B57"/>
+        </w:rPr>
+        <w:t>AI assurance:</w:t>
+      </w:r>
+      <w:r>
+        <w:t xml:space="preserve"> Langfuse model/provider, prompt version, tokens, cost, latency, grounding result, retries, evaluation and planner feedback.</w:t>
+      </w:r>
+    </w:p>
+    <w:p>
+      <w:pPr>
+        <w:pStyle w:val="ListNumber"/>
+      </w:pPr>
+      <w:r>
+        <w:rPr>
+          <w:b/>
+          <w:color w:val="173B57"/>
+        </w:rPr>
+        <w:t>Security audit:</w:t>
+      </w:r>
+      <w:r>
+        <w:t xml:space="preserve"> Hub database events for sign-in, membership, dataset replacement, assessment submission, SIG evidence reads, publication approval, administrative reads and credential rotation.</w:t>
+      </w:r>
+    </w:p>
+    <w:p>
+      <w:r>
+        <w:t>The Admin browser reads those views through protected Hub APIs. It does not receive direct observability-provider secret keys. Raw traces remain restricted by role and Hub.</w:t>
+      </w:r>
+    </w:p>
+    <w:p>
+      <w:pPr>
+        <w:pStyle w:val="Heading2"/>
+      </w:pPr>
+      <w:r>
+        <w:t>15.2 Health and metrics</w:t>
       </w:r>
     </w:p>
     <w:p>
@@ -4162,6 +4432,56 @@
     </w:p>
     <w:p>
       <w:r>
+        <w:t>Initial metric names:</w:t>
+      </w:r>
+    </w:p>
+    <w:p>
+      <w:pPr>
+        <w:spacing w:before="60" w:after="120"/>
+        <w:ind w:left="283" w:right="170"/>
+        <w:shd w:fill="EFF3F5"/>
+      </w:pPr>
+      <w:r>
+        <w:rPr>
+          <w:rFonts w:ascii="Consolas" w:hAnsi="Consolas"/>
+          <w:color w:val="173B57"/>
+          <w:sz w:val="15"/>
+        </w:rPr>
+        <w:t>grp_http_requests_total</w:t>
+        <w:br/>
+        <w:t>grp_http_request_duration_seconds</w:t>
+        <w:br/>
+        <w:t>grp_assessments_total</w:t>
+        <w:br/>
+        <w:t>grp_assessment_duration_seconds</w:t>
+        <w:br/>
+        <w:t>grp_job_queue_depth</w:t>
+        <w:br/>
+        <w:t>grp_job_queue_oldest_seconds</w:t>
+        <w:br/>
+        <w:t>grp_worker_heartbeat</w:t>
+        <w:br/>
+        <w:t>grp_worker_failures_total</w:t>
+        <w:br/>
+        <w:t>grp_sig_requests_total</w:t>
+        <w:br/>
+        <w:t>grp_sig_request_duration_seconds</w:t>
+        <w:br/>
+        <w:t>grp_sig_contract_errors_total</w:t>
+        <w:br/>
+        <w:t>grp_disk_used_ratio</w:t>
+        <w:br/>
+        <w:t>grp_backup_age_seconds</w:t>
+        <w:br/>
+        <w:t>grp_llm_tokens_total</w:t>
+        <w:br/>
+        <w:t>grp_llm_cost_usd_total</w:t>
+        <w:br/>
+        <w:t>grp_grounding_failures_total</w:t>
+      </w:r>
+    </w:p>
+    <w:p>
+      <w:r>
         <w:t xml:space="preserve">Use structured JSON logs with </w:t>
       </w:r>
       <w:r>
@@ -4195,7 +4515,7 @@
         <w:t>support_ref</w:t>
       </w:r>
       <w:r>
-        <w:t>, route and status. Redact authorization headers, cookies, tokens, raw uploaded features, signed URLs and draft/private evidence.</w:t>
+        <w:t>, route and status. Redact authorization headers, cookies, tokens, raw uploaded features, signed URLs, unrestricted prompts and draft/private evidence. Do not use user, assessment or dataset identifiers as metric labels because they leak context and create unsafe cardinality.</w:t>
       </w:r>
     </w:p>
     <w:p>
@@ -4203,7 +4523,7 @@
         <w:pStyle w:val="Heading2"/>
       </w:pPr>
       <w:r>
-        <w:t>15.2 Backup</w:t>
+        <w:t>15.3 Backup</w:t>
       </w:r>
     </w:p>
     <w:p>
@@ -4253,7 +4573,7 @@
         <w:pStyle w:val="Heading2"/>
       </w:pPr>
       <w:r>
-        <w:t>15.3 Failure behaviour</w:t>
+        <w:t>15.4 Failure behaviour</w:t>
       </w:r>
     </w:p>
     <w:p>

</xml_diff>